<commit_message>
Figuras com notas de leitura e relatório Word atualizado.
Restaura imagens Markdown em 3.7, acrescenta rodapé explicativo nos PNG
via gerar_figuras_relatorio.py e regenera o DOCX com gráficos embutidos.
</commit_message>
<xml_diff>
--- a/relatorio_investimentos.docx
+++ b/relatorio_investimentos.docx
@@ -3255,18 +3255,43 @@
     </w:p>
     <w:p>
       <w:pPr>
-        <w:spacing w:lineRule="auto" w:line="276" w:after="60"/>
-        <w:ind w:firstLine="567"/>
-        <w:jc w:val="both"/>
+        <w:spacing w:after="40"/>
+        <w:ind w:firstLine="0"/>
+        <w:jc w:val="center"/>
       </w:pPr>
       <w:r>
-        <w:rPr>
-          <w:rFonts w:ascii="Times New Roman" w:hAnsi="Times New Roman" w:eastAsia="Times New Roman" w:cs="Times New Roman"/>
-          <w:b w:val="0"/>
-          <w:i w:val="0"/>
-          <w:sz w:val="24"/>
-        </w:rPr>
-        <w:t>Figura 1 — Total pago por ano e variação % face ao ano anterior (GND 4 e 5, governo central).</w:t>
+        <w:drawing>
+          <wp:inline xmlns:a="http://schemas.openxmlformats.org/drawingml/2006/main" xmlns:pic="http://schemas.openxmlformats.org/drawingml/2006/picture">
+            <wp:extent cx="3600000" cy="1373844"/>
+            <wp:docPr id="1" name="Picture 1"/>
+            <wp:cNvGraphicFramePr>
+              <a:graphicFrameLocks noChangeAspect="1"/>
+            </wp:cNvGraphicFramePr>
+            <a:graphic>
+              <a:graphicData uri="http://schemas.openxmlformats.org/drawingml/2006/picture">
+                <pic:pic>
+                  <pic:nvPicPr>
+                    <pic:cNvPr id="0" name="fig01_evolucao.png"/>
+                    <pic:cNvPicPr/>
+                  </pic:nvPicPr>
+                  <pic:blipFill>
+                    <a:blip r:embed="rId10"/>
+                    <a:stretch>
+                      <a:fillRect/>
+                    </a:stretch>
+                  </pic:blipFill>
+                  <pic:spPr>
+                    <a:xfrm>
+                      <a:off x="0" y="0"/>
+                      <a:ext cx="3600000" cy="1373844"/>
+                    </a:xfrm>
+                    <a:prstGeom prst="rect"/>
+                  </pic:spPr>
+                </pic:pic>
+              </a:graphicData>
+            </a:graphic>
+          </wp:inline>
+        </w:drawing>
       </w:r>
     </w:p>
     <w:p>
@@ -3287,18 +3312,43 @@
     </w:p>
     <w:p>
       <w:pPr>
-        <w:spacing w:lineRule="auto" w:line="276" w:after="60"/>
-        <w:ind w:firstLine="567"/>
-        <w:jc w:val="both"/>
+        <w:spacing w:after="40"/>
+        <w:ind w:firstLine="0"/>
+        <w:jc w:val="center"/>
       </w:pPr>
       <w:r>
-        <w:rPr>
-          <w:rFonts w:ascii="Times New Roman" w:hAnsi="Times New Roman" w:eastAsia="Times New Roman" w:cs="Times New Roman"/>
-          <w:b w:val="0"/>
-          <w:i w:val="0"/>
-          <w:sz w:val="24"/>
-        </w:rPr>
-        <w:t>Figura 2 — Participação de cada grupo de despesa dentro de cada exercício (barras empilhadas a 100 %).</w:t>
+        <w:drawing>
+          <wp:inline xmlns:a="http://schemas.openxmlformats.org/drawingml/2006/main" xmlns:pic="http://schemas.openxmlformats.org/drawingml/2006/picture">
+            <wp:extent cx="3600000" cy="2039807"/>
+            <wp:docPr id="2" name="Picture 2"/>
+            <wp:cNvGraphicFramePr>
+              <a:graphicFrameLocks noChangeAspect="1"/>
+            </wp:cNvGraphicFramePr>
+            <a:graphic>
+              <a:graphicData uri="http://schemas.openxmlformats.org/drawingml/2006/picture">
+                <pic:pic>
+                  <pic:nvPicPr>
+                    <pic:cNvPr id="0" name="fig02_composicao.png"/>
+                    <pic:cNvPicPr/>
+                  </pic:nvPicPr>
+                  <pic:blipFill>
+                    <a:blip r:embed="rId11"/>
+                    <a:stretch>
+                      <a:fillRect/>
+                    </a:stretch>
+                  </pic:blipFill>
+                  <pic:spPr>
+                    <a:xfrm>
+                      <a:off x="0" y="0"/>
+                      <a:ext cx="3600000" cy="2039807"/>
+                    </a:xfrm>
+                    <a:prstGeom prst="rect"/>
+                  </pic:spPr>
+                </pic:pic>
+              </a:graphicData>
+            </a:graphic>
+          </wp:inline>
+        </w:drawing>
       </w:r>
     </w:p>
     <w:p>
@@ -3328,18 +3378,43 @@
     </w:p>
     <w:p>
       <w:pPr>
-        <w:spacing w:lineRule="auto" w:line="276" w:after="60"/>
-        <w:ind w:firstLine="567"/>
-        <w:jc w:val="both"/>
+        <w:spacing w:after="40"/>
+        <w:ind w:firstLine="0"/>
+        <w:jc w:val="center"/>
       </w:pPr>
       <w:r>
-        <w:rPr>
-          <w:rFonts w:ascii="Times New Roman" w:hAnsi="Times New Roman" w:eastAsia="Times New Roman" w:cs="Times New Roman"/>
-          <w:b w:val="0"/>
-          <w:i w:val="0"/>
-          <w:sz w:val="24"/>
-        </w:rPr>
-        <w:t>Figura 3 — Concentração por órgão máximo (12 maiores) e perfil mensal de caixa (soma dos anos).</w:t>
+        <w:drawing>
+          <wp:inline xmlns:a="http://schemas.openxmlformats.org/drawingml/2006/main" xmlns:pic="http://schemas.openxmlformats.org/drawingml/2006/picture">
+            <wp:extent cx="3600000" cy="2765314"/>
+            <wp:docPr id="3" name="Picture 3"/>
+            <wp:cNvGraphicFramePr>
+              <a:graphicFrameLocks noChangeAspect="1"/>
+            </wp:cNvGraphicFramePr>
+            <a:graphic>
+              <a:graphicData uri="http://schemas.openxmlformats.org/drawingml/2006/picture">
+                <pic:pic>
+                  <pic:nvPicPr>
+                    <pic:cNvPr id="0" name="fig03_orgaos_sazonalidade.png"/>
+                    <pic:cNvPicPr/>
+                  </pic:nvPicPr>
+                  <pic:blipFill>
+                    <a:blip r:embed="rId12"/>
+                    <a:stretch>
+                      <a:fillRect/>
+                    </a:stretch>
+                  </pic:blipFill>
+                  <pic:spPr>
+                    <a:xfrm>
+                      <a:off x="0" y="0"/>
+                      <a:ext cx="3600000" cy="2765314"/>
+                    </a:xfrm>
+                    <a:prstGeom prst="rect"/>
+                  </pic:spPr>
+                </pic:pic>
+              </a:graphicData>
+            </a:graphic>
+          </wp:inline>
+        </w:drawing>
       </w:r>
     </w:p>
     <w:p>
@@ -3360,18 +3435,43 @@
     </w:p>
     <w:p>
       <w:pPr>
-        <w:spacing w:lineRule="auto" w:line="276" w:after="60"/>
-        <w:ind w:firstLine="567"/>
-        <w:jc w:val="both"/>
+        <w:spacing w:after="40"/>
+        <w:ind w:firstLine="0"/>
+        <w:jc w:val="center"/>
       </w:pPr>
       <w:r>
-        <w:rPr>
-          <w:rFonts w:ascii="Times New Roman" w:hAnsi="Times New Roman" w:eastAsia="Times New Roman" w:cs="Times New Roman"/>
-          <w:b w:val="0"/>
-          <w:i w:val="0"/>
-          <w:sz w:val="24"/>
-        </w:rPr>
-        <w:t>Figura 4 — Pagamentos por região e ano (bilhões R$), após exclusão de categorias geográficas problemáticas.</w:t>
+        <w:drawing>
+          <wp:inline xmlns:a="http://schemas.openxmlformats.org/drawingml/2006/main" xmlns:pic="http://schemas.openxmlformats.org/drawingml/2006/picture">
+            <wp:extent cx="3600000" cy="2031781"/>
+            <wp:docPr id="4" name="Picture 4"/>
+            <wp:cNvGraphicFramePr>
+              <a:graphicFrameLocks noChangeAspect="1"/>
+            </wp:cNvGraphicFramePr>
+            <a:graphic>
+              <a:graphicData uri="http://schemas.openxmlformats.org/drawingml/2006/picture">
+                <pic:pic>
+                  <pic:nvPicPr>
+                    <pic:cNvPr id="0" name="fig04_regiao_ano.png"/>
+                    <pic:cNvPicPr/>
+                  </pic:nvPicPr>
+                  <pic:blipFill>
+                    <a:blip r:embed="rId13"/>
+                    <a:stretch>
+                      <a:fillRect/>
+                    </a:stretch>
+                  </pic:blipFill>
+                  <pic:spPr>
+                    <a:xfrm>
+                      <a:off x="0" y="0"/>
+                      <a:ext cx="3600000" cy="2031781"/>
+                    </a:xfrm>
+                    <a:prstGeom prst="rect"/>
+                  </pic:spPr>
+                </pic:pic>
+              </a:graphicData>
+            </a:graphic>
+          </wp:inline>
+        </w:drawing>
       </w:r>
     </w:p>
     <w:p>
@@ -3392,18 +3492,43 @@
     </w:p>
     <w:p>
       <w:pPr>
-        <w:spacing w:lineRule="auto" w:line="276" w:after="60"/>
-        <w:ind w:firstLine="567"/>
-        <w:jc w:val="both"/>
+        <w:spacing w:after="40"/>
+        <w:ind w:firstLine="0"/>
+        <w:jc w:val="center"/>
       </w:pPr>
       <w:r>
-        <w:rPr>
-          <w:rFonts w:ascii="Times New Roman" w:hAnsi="Times New Roman" w:eastAsia="Times New Roman" w:cs="Times New Roman"/>
-          <w:b w:val="0"/>
-          <w:i w:val="0"/>
-          <w:sz w:val="24"/>
-        </w:rPr>
-        <w:t>Figura 5 — Coeficientes de correlação (Pearson) entre totais anuais por macro-região (séries 2021–2025).</w:t>
+        <w:drawing>
+          <wp:inline xmlns:a="http://schemas.openxmlformats.org/drawingml/2006/main" xmlns:pic="http://schemas.openxmlformats.org/drawingml/2006/picture">
+            <wp:extent cx="3600000" cy="3087444"/>
+            <wp:docPr id="5" name="Picture 5"/>
+            <wp:cNvGraphicFramePr>
+              <a:graphicFrameLocks noChangeAspect="1"/>
+            </wp:cNvGraphicFramePr>
+            <a:graphic>
+              <a:graphicData uri="http://schemas.openxmlformats.org/drawingml/2006/picture">
+                <pic:pic>
+                  <pic:nvPicPr>
+                    <pic:cNvPr id="0" name="fig05_correlacao_regioes.png"/>
+                    <pic:cNvPicPr/>
+                  </pic:nvPicPr>
+                  <pic:blipFill>
+                    <a:blip r:embed="rId14"/>
+                    <a:stretch>
+                      <a:fillRect/>
+                    </a:stretch>
+                  </pic:blipFill>
+                  <pic:spPr>
+                    <a:xfrm>
+                      <a:off x="0" y="0"/>
+                      <a:ext cx="3600000" cy="3087444"/>
+                    </a:xfrm>
+                    <a:prstGeom prst="rect"/>
+                  </pic:spPr>
+                </pic:pic>
+              </a:graphicData>
+            </a:graphic>
+          </wp:inline>
+        </w:drawing>
       </w:r>
     </w:p>
     <w:p>

</xml_diff>